<commit_message>
Sharing the gospel page
</commit_message>
<xml_diff>
--- a/WDD 130.docx
+++ b/WDD 130.docx
@@ -2651,7 +2651,7 @@
                 <w:sz w:val="16"/>
                 <w:szCs w:val="16"/>
               </w:rPr>
-              <w:t>Online Quiz</w:t>
+              <w:t>In class quiz (Kahoot)</w:t>
             </w:r>
           </w:p>
         </w:tc>
@@ -2862,7 +2862,7 @@
                 <w:sz w:val="16"/>
                 <w:szCs w:val="16"/>
               </w:rPr>
-              <w:t>Teach one another - Industry Pioneers Research (use interactive technology)</w:t>
+              <w:t xml:space="preserve">Teach one another - Industry Pioneers Research </w:t>
             </w:r>
           </w:p>
           <w:p>
@@ -2978,6 +2978,22 @@
               </w:rPr>
               <w:t>Class presentation</w:t>
             </w:r>
+            <w:r>
+              <w:rPr>
+                <w:rFonts w:ascii="Cambria" w:eastAsia="Arial Unicode MS" w:hAnsi="Cambria" w:cs="Arial Unicode MS"/>
+                <w:sz w:val="16"/>
+                <w:szCs w:val="16"/>
+              </w:rPr>
+              <w:t xml:space="preserve"> </w:t>
+            </w:r>
+            <w:r>
+              <w:rPr>
+                <w:rFonts w:ascii="Cambria" w:eastAsia="Arial Unicode MS" w:hAnsi="Cambria" w:cs="Arial Unicode MS"/>
+                <w:sz w:val="16"/>
+                <w:szCs w:val="16"/>
+              </w:rPr>
+              <w:t>(Padlet)</w:t>
+            </w:r>
           </w:p>
         </w:tc>
         <w:tc>
@@ -3165,7 +3181,23 @@
                 <w:sz w:val="16"/>
                 <w:szCs w:val="16"/>
               </w:rPr>
-              <w:t>Basic Portal page with images and links and simple styles</w:t>
+              <w:t xml:space="preserve">Basic </w:t>
+            </w:r>
+            <w:r>
+              <w:rPr>
+                <w:rFonts w:ascii="Cambria" w:eastAsia="Arial Unicode MS" w:hAnsi="Cambria" w:cs="Arial Unicode MS"/>
+                <w:sz w:val="16"/>
+                <w:szCs w:val="16"/>
+              </w:rPr>
+              <w:t>p</w:t>
+            </w:r>
+            <w:r>
+              <w:rPr>
+                <w:rFonts w:ascii="Cambria" w:eastAsia="Arial Unicode MS" w:hAnsi="Cambria" w:cs="Arial Unicode MS"/>
+                <w:sz w:val="16"/>
+                <w:szCs w:val="16"/>
+              </w:rPr>
+              <w:t>ortal page with images and links and simple styles</w:t>
             </w:r>
           </w:p>
           <w:p>
@@ -6571,23 +6603,13 @@
                 <w:szCs w:val="16"/>
               </w:rPr>
             </w:pPr>
-            <w:proofErr w:type="spellStart"/>
-            <w:r>
-              <w:rPr>
-                <w:rFonts w:ascii="Cambria" w:eastAsia="Arial Unicode MS" w:hAnsi="Cambria" w:cs="Arial Unicode MS"/>
-                <w:sz w:val="16"/>
-                <w:szCs w:val="16"/>
-              </w:rPr>
-              <w:t>Treach</w:t>
-            </w:r>
-            <w:proofErr w:type="spellEnd"/>
-            <w:r>
-              <w:rPr>
-                <w:rFonts w:ascii="Cambria" w:eastAsia="Arial Unicode MS" w:hAnsi="Cambria" w:cs="Arial Unicode MS"/>
-                <w:sz w:val="16"/>
-                <w:szCs w:val="16"/>
-              </w:rPr>
-              <w:t xml:space="preserve"> </w:t>
+            <w:r>
+              <w:rPr>
+                <w:rFonts w:ascii="Cambria" w:eastAsia="Arial Unicode MS" w:hAnsi="Cambria" w:cs="Arial Unicode MS"/>
+                <w:sz w:val="16"/>
+                <w:szCs w:val="16"/>
+              </w:rPr>
+              <w:t xml:space="preserve">Teach </w:t>
             </w:r>
             <w:r>
               <w:rPr>
@@ -7341,7 +7363,23 @@
                 <w:sz w:val="16"/>
                 <w:szCs w:val="16"/>
               </w:rPr>
-              <w:t>Favorite Books HTML Table/Form ICE challenge</w:t>
+              <w:t xml:space="preserve">Favorite </w:t>
+            </w:r>
+            <w:r>
+              <w:rPr>
+                <w:rFonts w:ascii="Cambria" w:eastAsia="Arial Unicode MS" w:hAnsi="Cambria" w:cs="Arial Unicode MS"/>
+                <w:sz w:val="16"/>
+                <w:szCs w:val="16"/>
+              </w:rPr>
+              <w:t>Devo</w:t>
+            </w:r>
+            <w:r>
+              <w:rPr>
+                <w:rFonts w:ascii="Cambria" w:eastAsia="Arial Unicode MS" w:hAnsi="Cambria" w:cs="Arial Unicode MS"/>
+                <w:sz w:val="16"/>
+                <w:szCs w:val="16"/>
+              </w:rPr>
+              <w:t xml:space="preserve"> HTML Table/Form ICE challenge</w:t>
             </w:r>
           </w:p>
           <w:p>
@@ -7989,7 +8027,39 @@
                 <w:sz w:val="16"/>
                 <w:szCs w:val="16"/>
               </w:rPr>
-              <w:t>Slow Photo Gallery ICE challenge</w:t>
+              <w:t xml:space="preserve">Slow </w:t>
+            </w:r>
+            <w:r>
+              <w:rPr>
+                <w:rFonts w:ascii="Cambria" w:eastAsia="Arial Unicode MS" w:hAnsi="Cambria" w:cs="Arial Unicode MS"/>
+                <w:sz w:val="16"/>
+                <w:szCs w:val="16"/>
+              </w:rPr>
+              <w:t>loading p</w:t>
+            </w:r>
+            <w:r>
+              <w:rPr>
+                <w:rFonts w:ascii="Cambria" w:eastAsia="Arial Unicode MS" w:hAnsi="Cambria" w:cs="Arial Unicode MS"/>
+                <w:sz w:val="16"/>
+                <w:szCs w:val="16"/>
+              </w:rPr>
+              <w:t xml:space="preserve">hoto </w:t>
+            </w:r>
+            <w:r>
+              <w:rPr>
+                <w:rFonts w:ascii="Cambria" w:eastAsia="Arial Unicode MS" w:hAnsi="Cambria" w:cs="Arial Unicode MS"/>
+                <w:sz w:val="16"/>
+                <w:szCs w:val="16"/>
+              </w:rPr>
+              <w:t>g</w:t>
+            </w:r>
+            <w:r>
+              <w:rPr>
+                <w:rFonts w:ascii="Cambria" w:eastAsia="Arial Unicode MS" w:hAnsi="Cambria" w:cs="Arial Unicode MS"/>
+                <w:sz w:val="16"/>
+                <w:szCs w:val="16"/>
+              </w:rPr>
+              <w:t>allery ICE challenge</w:t>
             </w:r>
           </w:p>
           <w:p>
@@ -9067,7 +9137,6 @@
                 <w:sz w:val="16"/>
                 <w:szCs w:val="16"/>
               </w:rPr>
-              <w:lastRenderedPageBreak/>
               <w:t>Content and Images</w:t>
             </w:r>
           </w:p>
@@ -9121,7 +9190,6 @@
                 <w:sz w:val="16"/>
                 <w:szCs w:val="16"/>
               </w:rPr>
-              <w:lastRenderedPageBreak/>
               <w:t>Online deliverable</w:t>
             </w:r>
           </w:p>

</xml_diff>